<commit_message>
fix(md_to_docx): join soft-wrapped emphasis so no asterisks leak into Word docs
</commit_message>
<xml_diff>
--- a/docs/case-study-hku.docx
+++ b/docs/case-study-hku.docx
@@ -103,12 +103,16 @@
     </w:p>
     <w:p>
       <w:r>
-        <w:t xml:space="preserve">So the problem was not "how do I prompt better". It was: **how do I hold a world in place across</w:t>
-      </w:r>
-    </w:p>
-    <w:p>
-      <w:r>
-        <w:t xml:space="preserve">210 shots when the tool that makes the shots has no memory at all.** That is a production problem,</w:t>
+        <w:t xml:space="preserve">So the problem was not "how do I prompt better". It was: </w:t>
+      </w:r>
+      <w:r>
+        <w:rPr>
+          <w:b/>
+        </w:rPr>
+        <w:t xml:space="preserve">how do I hold a world in place across 210 shots when the tool that makes the shots has no memory at all.</w:t>
+      </w:r>
+      <w:r>
+        <w:t xml:space="preserve"> That is a production problem,</w:t>
       </w:r>
     </w:p>
     <w:p>

</xml_diff>